<commit_message>
fix: keep the speciality blank
</commit_message>
<xml_diff>
--- a/modeles/doctorat/Page_1.docx
+++ b/modeles/doctorat/Page_1.docx
@@ -83,7 +83,7 @@
         <w:rPr>
           <w:color w:val="BFBFBF" w:themeColor="background1" w:themeShade="BF"/>
         </w:rPr>
-        <w:t xml:space="preserve">{{NUM_PV}}</w:t>
+        <w:t>{{NUM_PV}}</w:t>
       </w:r>
       <w:r>
         <w:t>/2026</w:t>
@@ -140,7 +140,7 @@
               </w:rPr>
             </w:pPr>
             <w:r>
-              <w:t xml:space="preserve">{{NOM}} {{PRENOM}}</w:t>
+              <w:t>{{NOM}} {{PRENOM}}</w:t>
             </w:r>
           </w:p>
         </w:tc>
@@ -184,7 +184,7 @@
                 <w:rFonts w:ascii="Corbel Light" w:hAnsi="Corbel Light"/>
                 <w:b/>
               </w:rPr>
-              <w:t xml:space="preserve">{{DATE_NAISSANCE}} à {{LIEU_NAISSANCE}}</w:t>
+              <w:t>{{DATE_NAISSANCE}} à {{LIEU_NAISSANCE}}</w:t>
             </w:r>
           </w:p>
         </w:tc>
@@ -228,7 +228,7 @@
                 <w:rFonts w:ascii="Corbel Light" w:hAnsi="Corbel Light"/>
                 <w:b/>
               </w:rPr>
-              <w:t xml:space="preserve">{{CNE}}</w:t>
+              <w:t>{{CNE}}</w:t>
             </w:r>
           </w:p>
         </w:tc>
@@ -272,7 +272,7 @@
                 <w:rFonts w:ascii="Corbel Light" w:hAnsi="Corbel Light"/>
                 <w:b/>
               </w:rPr>
-              <w:t xml:space="preserve">{{CIN}}</w:t>
+              <w:t>{{CIN}}</w:t>
             </w:r>
           </w:p>
         </w:tc>
@@ -316,7 +316,7 @@
                 <w:rFonts w:ascii="Corbel Light" w:hAnsi="Corbel Light"/>
                 <w:b/>
               </w:rPr>
-              <w:t xml:space="preserve">{{FORMATION}}</w:t>
+              <w:t>{{FORMATION}}</w:t>
             </w:r>
           </w:p>
         </w:tc>
@@ -437,7 +437,7 @@
                 <w:sz w:val="28"/>
                 <w:szCs w:val="28"/>
               </w:rPr>
-              <w:t xml:space="preserve">« {{TITRE}} »</w:t>
+              <w:t>« {{TITRE}} »</w:t>
             </w:r>
           </w:p>
         </w:tc>
@@ -457,8 +457,8 @@
         <w:tblLook w:val="04A0" w:firstRow="1" w:lastRow="0" w:firstColumn="1" w:lastColumn="0" w:noHBand="0" w:noVBand="1"/>
       </w:tblPr>
       <w:tblGrid>
-        <w:gridCol w:w="4606"/>
-        <w:gridCol w:w="4606"/>
+        <w:gridCol w:w="4601"/>
+        <w:gridCol w:w="4685"/>
       </w:tblGrid>
       <w:tr>
         <w:tc>
@@ -493,8 +493,10 @@
               <w:rPr>
                 <w:rFonts w:ascii="Corbel Light" w:hAnsi="Corbel Light"/>
               </w:rPr>
-              <w:t xml:space="preserve">{{SPECIALITE}}</w:t>
-            </w:r>
+              <w:t>………………………………………………………………………….</w:t>
+            </w:r>
+            <w:bookmarkStart w:id="0" w:name="_GoBack"/>
+            <w:bookmarkEnd w:id="0"/>
           </w:p>
         </w:tc>
       </w:tr>
@@ -533,7 +535,7 @@
                 <w:rFonts w:ascii="Corbel Light" w:hAnsi="Corbel Light"/>
                 <w:b/>
               </w:rPr>
-              <w:t xml:space="preserve">{{DATE_SOUTENANCE}}</w:t>
+              <w:t>{{DATE_SOUTENANCE}}</w:t>
             </w:r>
           </w:p>
         </w:tc>
@@ -573,21 +575,7 @@
                 <w:rFonts w:ascii="Corbel Light" w:hAnsi="Corbel Light"/>
                 <w:b/>
               </w:rPr>
-              <w:t xml:space="preserve">{{LIEU_SOUTENANCE}}</w:t>
-            </w:r>
-            <w:r>
-              <w:rPr>
-                <w:rFonts w:ascii="Corbel Light" w:hAnsi="Corbel Light"/>
-                <w:b/>
-              </w:rPr>
-              <w:t xml:space="preserve"/>
-            </w:r>
-            <w:r>
-              <w:rPr>
-                <w:rFonts w:ascii="Corbel Light" w:hAnsi="Corbel Light"/>
-                <w:b/>
-              </w:rPr>
-              <w:t xml:space="preserve"/>
+              <w:t>{{LIEU_SOUTENANCE}}</w:t>
             </w:r>
           </w:p>
         </w:tc>
@@ -678,7 +666,7 @@
                 <w:sz w:val="20"/>
                 <w:szCs w:val="20"/>
               </w:rPr>
-              <w:t xml:space="preserve">{{J1_COURT}}</w:t>
+              <w:t>{{J1_COURT}}</w:t>
             </w:r>
           </w:p>
         </w:tc>
@@ -726,7 +714,7 @@
                 <w:sz w:val="20"/>
                 <w:szCs w:val="20"/>
               </w:rPr>
-              <w:t xml:space="preserve">{{J1_AFF}}</w:t>
+              <w:t>{{J1_AFF}}</w:t>
             </w:r>
           </w:p>
         </w:tc>
@@ -782,7 +770,7 @@
                 <w:sz w:val="20"/>
                 <w:szCs w:val="20"/>
               </w:rPr>
-              <w:t xml:space="preserve">{{J2_COURT}}</w:t>
+              <w:t>{{J2_COURT}}</w:t>
             </w:r>
           </w:p>
         </w:tc>
@@ -830,7 +818,7 @@
                 <w:sz w:val="20"/>
                 <w:szCs w:val="20"/>
               </w:rPr>
-              <w:t xml:space="preserve">{{J2_AFF}}</w:t>
+              <w:t>{{J2_AFF}}</w:t>
             </w:r>
           </w:p>
         </w:tc>
@@ -920,7 +908,7 @@
                 <w:rFonts w:ascii="Corbel Light" w:hAnsi="Corbel Light"/>
                 <w:b/>
               </w:rPr>
-              <w:t xml:space="preserve">{{J3_COURT}}</w:t>
+              <w:t>{{J3_COURT}}</w:t>
             </w:r>
           </w:p>
         </w:tc>
@@ -966,7 +954,7 @@
                 <w:sz w:val="20"/>
                 <w:szCs w:val="20"/>
               </w:rPr>
-              <w:t xml:space="preserve">{{J3_AFF}}</w:t>
+              <w:t>{{J3_AFF}}</w:t>
             </w:r>
           </w:p>
         </w:tc>
@@ -1012,7 +1000,7 @@
                 <w:rFonts w:ascii="Corbel Light" w:hAnsi="Corbel Light"/>
                 <w:b/>
               </w:rPr>
-              <w:t xml:space="preserve">{{J4_COURT}}</w:t>
+              <w:t>{{J4_COURT}}</w:t>
             </w:r>
           </w:p>
         </w:tc>
@@ -1058,7 +1046,7 @@
                 <w:sz w:val="20"/>
                 <w:szCs w:val="20"/>
               </w:rPr>
-              <w:t xml:space="preserve">{{J4_AFF}}</w:t>
+              <w:t>{{J4_AFF}}</w:t>
             </w:r>
           </w:p>
         </w:tc>
@@ -1104,7 +1092,7 @@
                 <w:rFonts w:ascii="Corbel Light" w:hAnsi="Corbel Light"/>
                 <w:b/>
               </w:rPr>
-              <w:t xml:space="preserve">{{J5_COURT}}</w:t>
+              <w:t>{{J5_COURT}}</w:t>
             </w:r>
           </w:p>
         </w:tc>
@@ -1150,7 +1138,7 @@
                 <w:sz w:val="20"/>
                 <w:szCs w:val="20"/>
               </w:rPr>
-              <w:t xml:space="preserve">{{J5_AFF}}</w:t>
+              <w:t>{{J5_AFF}}</w:t>
             </w:r>
           </w:p>
         </w:tc>
@@ -1200,7 +1188,7 @@
                 <w:sz w:val="20"/>
                 <w:szCs w:val="20"/>
               </w:rPr>
-              <w:t xml:space="preserve">{{J6_COURT}}</w:t>
+              <w:t>{{J6_COURT}}</w:t>
             </w:r>
           </w:p>
         </w:tc>
@@ -1248,7 +1236,7 @@
                 <w:sz w:val="20"/>
                 <w:szCs w:val="20"/>
               </w:rPr>
-              <w:t xml:space="preserve">{{J6_AFF}}</w:t>
+              <w:t>{{J6_AFF}}</w:t>
             </w:r>
           </w:p>
         </w:tc>
@@ -1298,7 +1286,7 @@
                 <w:sz w:val="20"/>
                 <w:szCs w:val="20"/>
               </w:rPr>
-              <w:t xml:space="preserve">{{J7_COURT}}</w:t>
+              <w:t>{{J7_COURT}}</w:t>
             </w:r>
           </w:p>
         </w:tc>
@@ -1346,18 +1334,8 @@
                 <w:sz w:val="20"/>
                 <w:szCs w:val="20"/>
               </w:rPr>
-              <w:t xml:space="preserve">{{J7_AFF}}</w:t>
-            </w:r>
-            <w:r>
-              <w:rPr>
-                <w:rFonts w:ascii="Corbel Light" w:hAnsi="Corbel Light"/>
-                <w:sz w:val="20"/>
-                <w:szCs w:val="20"/>
-              </w:rPr>
-              <w:t xml:space="preserve"/>
-            </w:r>
-            <w:bookmarkStart w:id="0" w:name="_GoBack"/>
-            <w:bookmarkEnd w:id="0"/>
+              <w:t>{{J7_AFF}}</w:t>
+            </w:r>
           </w:p>
         </w:tc>
         <w:tc>

</xml_diff>